<commit_message>
Resolve points 2/3 checkpoint-independence caveats with real re-verification
Both re-measured with the corrected (fingerprint-verified) checkpoint:
point 3 (profiling/torch.compile/TF32) essentially identical to the
original run, and point 2 (batch size/throughput) essentially identical
plus extended with two new matched-memory scenarios (each method capped
at the other's own memory ceiling). Reply drafts (.md and .docx) updated
to remove both caveats and reflect the real matched-memory table and new
figure; PROJECT_STATUS.md records the confirmation.

Co-Authored-By: Claude Sonnet 5 <noreply@anthropic.com>
Claude-Session: https://claude.ai/code/session_01HX6Lr5YENQbEkvto9y2AB8
</commit_message>
<xml_diff>
--- a/advisor_feedback/2026-09-13_reply_to_round10_draft.docx
+++ b/advisor_feedback/2026-09-13_reply_to_round10_draft.docx
@@ -55,9 +55,8 @@
         <w:rPr>
           <w:i/>
           <w:iCs/>
-          <w:color w:val="C00000"/>
         </w:rPr>
-        <w:t xml:space="preserve">3. Points 2 and 3's numbers below were measured before the checkpoint-resolution bug fix (using the wrong, data-driven checkpoint) — timing/memory should not depend on which trained weights are loaded (same architecture, same compute graph), but this has NOT been re-verified with the corrected checkpoint yet. Flagged inline below too.</w:t>
+        <w:t xml:space="preserve">3. Points 2 and 3 were both re-measured with the corrected checkpoint and confirmed essentially identical to the original (wrong-checkpoint) measurement in both cases — both resolved, no caveats remain.</w:t>
       </w:r>
     </w:p>
     <w:p>
@@ -982,7 +981,7 @@
         <w:spacing w:after="160"/>
       </w:pPr>
       <w:r>
-        <w:t xml:space="preserve">At each method's own maximum feasible batch size on the same GPU:</w:t>
+        <w:t xml:space="preserve">Re-measured with the corrected checkpoint, including two additional matched-memory scenarios (each method capped at the other's own memory ceiling), N=21:</w:t>
       </w:r>
     </w:p>
     <w:tbl>
@@ -998,15 +997,15 @@
         </w:tblBorders>
       </w:tblPr>
       <w:tblGrid>
-        <w:gridCol w:w="2600"/>
-        <w:gridCol w:w="2400"/>
-        <w:gridCol w:w="2400"/>
-        <w:gridCol w:w="3000"/>
+        <w:gridCol w:w="3200"/>
+        <w:gridCol w:w="2200"/>
+        <w:gridCol w:w="2200"/>
+        <w:gridCol w:w="2800"/>
       </w:tblGrid>
       <w:tr>
         <w:tc>
           <w:tcPr>
-            <w:tcW w:type="dxa" w:w="2600"/>
+            <w:tcW w:type="dxa" w:w="3200"/>
             <w:shd w:fill="DDDDDD" w:val="clear"/>
           </w:tcPr>
           <w:p>
@@ -1017,13 +1016,13 @@
                 <w:sz w:val="19"/>
                 <w:szCs w:val="19"/>
               </w:rPr>
-              <w:t xml:space="preserve">Method</w:t>
-            </w:r>
-          </w:p>
-        </w:tc>
-        <w:tc>
-          <w:tcPr>
-            <w:tcW w:type="dxa" w:w="2400"/>
+              <w:t xml:space="preserve">Scenario</w:t>
+            </w:r>
+          </w:p>
+        </w:tc>
+        <w:tc>
+          <w:tcPr>
+            <w:tcW w:type="dxa" w:w="2200"/>
             <w:shd w:fill="DDDDDD" w:val="clear"/>
           </w:tcPr>
           <w:p>
@@ -1040,7 +1039,7 @@
         </w:tc>
         <w:tc>
           <w:tcPr>
-            <w:tcW w:type="dxa" w:w="2400"/>
+            <w:tcW w:type="dxa" w:w="2200"/>
             <w:shd w:fill="DDDDDD" w:val="clear"/>
           </w:tcPr>
           <w:p>
@@ -1057,7 +1056,7 @@
         </w:tc>
         <w:tc>
           <w:tcPr>
-            <w:tcW w:type="dxa" w:w="3000"/>
+            <w:tcW w:type="dxa" w:w="2800"/>
             <w:shd w:fill="DDDDDD" w:val="clear"/>
           </w:tcPr>
           <w:p>
@@ -1076,7 +1075,7 @@
       <w:tr>
         <w:tc>
           <w:tcPr>
-            <w:tcW w:type="dxa" w:w="2600"/>
+            <w:tcW w:type="dxa" w:w="3200"/>
           </w:tcPr>
           <w:p>
             <w:r>
@@ -1092,7 +1091,7 @@
         </w:tc>
         <w:tc>
           <w:tcPr>
-            <w:tcW w:type="dxa" w:w="2400"/>
+            <w:tcW w:type="dxa" w:w="2200"/>
           </w:tcPr>
           <w:p>
             <w:r>
@@ -1108,7 +1107,7 @@
         </w:tc>
         <w:tc>
           <w:tcPr>
-            <w:tcW w:type="dxa" w:w="2400"/>
+            <w:tcW w:type="dxa" w:w="2200"/>
           </w:tcPr>
           <w:p>
             <w:r>
@@ -1124,17 +1123,17 @@
         </w:tc>
         <w:tc>
           <w:tcPr>
-            <w:tcW w:type="dxa" w:w="3000"/>
-          </w:tcPr>
-          <w:p>
-            <w:r>
-              <w:rPr>
-                <w:b w:val="false"/>
-                <w:bCs w:val="false"/>
-                <w:sz w:val="19"/>
-                <w:szCs w:val="19"/>
-              </w:rPr>
-              <w:t xml:space="preserve">4,212.66 samples/s</w:t>
+            <w:tcW w:type="dxa" w:w="2800"/>
+          </w:tcPr>
+          <w:p>
+            <w:r>
+              <w:rPr>
+                <w:b w:val="false"/>
+                <w:bCs w:val="false"/>
+                <w:sz w:val="19"/>
+                <w:szCs w:val="19"/>
+              </w:rPr>
+              <w:t xml:space="preserve">4,203.79 samples/s</w:t>
             </w:r>
           </w:p>
         </w:tc>
@@ -1142,7 +1141,7 @@
       <w:tr>
         <w:tc>
           <w:tcPr>
-            <w:tcW w:type="dxa" w:w="2600"/>
+            <w:tcW w:type="dxa" w:w="3200"/>
           </w:tcPr>
           <w:p>
             <w:r>
@@ -1158,7 +1157,7 @@
         </w:tc>
         <w:tc>
           <w:tcPr>
-            <w:tcW w:type="dxa" w:w="2400"/>
+            <w:tcW w:type="dxa" w:w="2200"/>
           </w:tcPr>
           <w:p>
             <w:r>
@@ -1174,7 +1173,7 @@
         </w:tc>
         <w:tc>
           <w:tcPr>
-            <w:tcW w:type="dxa" w:w="2400"/>
+            <w:tcW w:type="dxa" w:w="2200"/>
           </w:tcPr>
           <w:p>
             <w:r>
@@ -1190,7 +1189,7 @@
         </w:tc>
         <w:tc>
           <w:tcPr>
-            <w:tcW w:type="dxa" w:w="3000"/>
+            <w:tcW w:type="dxa" w:w="2800"/>
           </w:tcPr>
           <w:p>
             <w:r>
@@ -1201,6 +1200,138 @@
                 <w:szCs w:val="19"/>
               </w:rPr>
               <w:t xml:space="preserve">2.86 samples/s</w:t>
+            </w:r>
+          </w:p>
+        </w:tc>
+      </w:tr>
+      <w:tr>
+        <w:tc>
+          <w:tcPr>
+            <w:tcW w:type="dxa" w:w="3200"/>
+          </w:tcPr>
+          <w:p>
+            <w:r>
+              <w:rPr>
+                <w:b w:val="false"/>
+                <w:bCs w:val="false"/>
+                <w:sz w:val="19"/>
+                <w:szCs w:val="19"/>
+              </w:rPr>
+              <w:t xml:space="preserve">FEM (capped at NO's 47.6 GB)</w:t>
+            </w:r>
+          </w:p>
+        </w:tc>
+        <w:tc>
+          <w:tcPr>
+            <w:tcW w:type="dxa" w:w="2200"/>
+          </w:tcPr>
+          <w:p>
+            <w:r>
+              <w:rPr>
+                <w:b w:val="false"/>
+                <w:bCs w:val="false"/>
+                <w:sz w:val="19"/>
+                <w:szCs w:val="19"/>
+              </w:rPr>
+              <w:t xml:space="preserve">256</w:t>
+            </w:r>
+          </w:p>
+        </w:tc>
+        <w:tc>
+          <w:tcPr>
+            <w:tcW w:type="dxa" w:w="2200"/>
+          </w:tcPr>
+          <w:p>
+            <w:r>
+              <w:rPr>
+                <w:b w:val="false"/>
+                <w:bCs w:val="false"/>
+                <w:sz w:val="19"/>
+                <w:szCs w:val="19"/>
+              </w:rPr>
+              <w:t xml:space="preserve">38.7 GB</w:t>
+            </w:r>
+          </w:p>
+        </w:tc>
+        <w:tc>
+          <w:tcPr>
+            <w:tcW w:type="dxa" w:w="2800"/>
+          </w:tcPr>
+          <w:p>
+            <w:r>
+              <w:rPr>
+                <w:b w:val="false"/>
+                <w:bCs w:val="false"/>
+                <w:sz w:val="19"/>
+                <w:szCs w:val="19"/>
+              </w:rPr>
+              <w:t xml:space="preserve">2.86 samples/s</w:t>
+            </w:r>
+          </w:p>
+        </w:tc>
+      </w:tr>
+      <w:tr>
+        <w:tc>
+          <w:tcPr>
+            <w:tcW w:type="dxa" w:w="3200"/>
+          </w:tcPr>
+          <w:p>
+            <w:r>
+              <w:rPr>
+                <w:b w:val="false"/>
+                <w:bCs w:val="false"/>
+                <w:sz w:val="19"/>
+                <w:szCs w:val="19"/>
+              </w:rPr>
+              <w:t xml:space="preserve">NO (capped at FEM's 38.7 GB)</w:t>
+            </w:r>
+          </w:p>
+        </w:tc>
+        <w:tc>
+          <w:tcPr>
+            <w:tcW w:type="dxa" w:w="2200"/>
+          </w:tcPr>
+          <w:p>
+            <w:r>
+              <w:rPr>
+                <w:b w:val="false"/>
+                <w:bCs w:val="false"/>
+                <w:sz w:val="19"/>
+                <w:szCs w:val="19"/>
+              </w:rPr>
+              <w:t xml:space="preserve">4,096</w:t>
+            </w:r>
+          </w:p>
+        </w:tc>
+        <w:tc>
+          <w:tcPr>
+            <w:tcW w:type="dxa" w:w="2200"/>
+          </w:tcPr>
+          <w:p>
+            <w:r>
+              <w:rPr>
+                <w:b w:val="false"/>
+                <w:bCs w:val="false"/>
+                <w:sz w:val="19"/>
+                <w:szCs w:val="19"/>
+              </w:rPr>
+              <w:t xml:space="preserve">23.8 GB</w:t>
+            </w:r>
+          </w:p>
+        </w:tc>
+        <w:tc>
+          <w:tcPr>
+            <w:tcW w:type="dxa" w:w="2800"/>
+          </w:tcPr>
+          <w:p>
+            <w:r>
+              <w:rPr>
+                <w:b w:val="false"/>
+                <w:bCs w:val="false"/>
+                <w:sz w:val="19"/>
+                <w:szCs w:val="19"/>
+              </w:rPr>
+              <w:t xml:space="preserve">4,207.75 samples/s</w:t>
             </w:r>
           </w:p>
         </w:tc>
@@ -1217,412 +1348,7 @@
           <w:sz w:val="18"/>
           <w:szCs w:val="18"/>
         </w:rPr>
-        <w:t xml:space="preserve">Table 2. Max feasible batch size and throughput, NO vs. native FEM, same GPU.</w:t>
-      </w:r>
-    </w:p>
-    <w:p>
-      <w:pPr>
-        <w:spacing w:after="160"/>
-      </w:pPr>
-      <w:r>
-        <w:t xml:space="preserve">Peak throughput favors the NO by roughly 1,473x. Batching helps the NO substantially (throughput rises ~20x from bs=1 to its own ceiling) while FEM barely benefits (~4.8x) — matching your own stated expectation directly.</w:t>
-      </w:r>
-    </w:p>
-    <w:p>
-      <w:pPr>
-        <w:spacing w:after="160"/>
-      </w:pPr>
-      <w:r>
-        <w:rPr>
-          <w:i/>
-          <w:iCs/>
-          <w:color w:val="C00000"/>
-        </w:rPr>
-        <w:t xml:space="preserve">[Caveat: this measurement predates the checkpoint-resolution fix mentioned above — used the wrong (data-driven) checkpoint. Timing/memory should be checkpoint-independent (same architecture regardless of trained weights), but this has not yet been re-confirmed with the corrected checkpoint.]</w:t>
-      </w:r>
-    </w:p>
-    <w:p>
-      <w:pPr>
-        <w:pStyle w:val="Heading2"/>
-        <w:spacing w:after="150" w:before="300"/>
-      </w:pPr>
-      <w:r>
-        <w:t xml:space="preserve">3. NO inference optimization and profiling</w:t>
-      </w:r>
-    </w:p>
-    <w:p>
-      <w:pPr>
-        <w:spacing w:after="160"/>
-      </w:pPr>
-      <w:r>
-        <w:t xml:space="preserve">Pure GPU forward-pass time after warm-up (excluding data transfer/preprocessing), fp32, batch size 1, N=1401: 2,290 ms/sample. Peak GPU memory: 23.16 GB — notably higher than our own GPU-FEM solver's peak memory at the same N (15.6-20.5 GB), so the NO is not the more memory-frugal option here either. Profiler breakdown: ~67% of time in batched matmuls (the slice-based attention operating on ~2M mesh nodes), ~22% in the MLP layers — the cost is in genuine core compute at this token count, not an obvious inefficiency.</w:t>
-      </w:r>
-    </w:p>
-    <w:tbl>
-      <w:tblPr>
-        <w:tblW w:type="dxa" w:w="9400"/>
-        <w:tblBorders>
-          <w:top w:val="single" w:color="auto" w:sz="4"/>
-          <w:left w:val="single" w:color="auto" w:sz="4"/>
-          <w:bottom w:val="single" w:color="auto" w:sz="4"/>
-          <w:right w:val="single" w:color="auto" w:sz="4"/>
-          <w:insideH w:val="single" w:color="auto" w:sz="4"/>
-          <w:insideV w:val="single" w:color="auto" w:sz="4"/>
-        </w:tblBorders>
-      </w:tblPr>
-      <w:tblGrid>
-        <w:gridCol w:w="2600"/>
-        <w:gridCol w:w="2200"/>
-        <w:gridCol w:w="2400"/>
-        <w:gridCol w:w="2200"/>
-      </w:tblGrid>
-      <w:tr>
-        <w:tc>
-          <w:tcPr>
-            <w:tcW w:type="dxa" w:w="2600"/>
-            <w:shd w:fill="DDDDDD" w:val="clear"/>
-          </w:tcPr>
-          <w:p>
-            <w:r>
-              <w:rPr>
-                <w:b/>
-                <w:bCs/>
-                <w:sz w:val="19"/>
-                <w:szCs w:val="19"/>
-              </w:rPr>
-              <w:t xml:space="preserve">Variant</w:t>
-            </w:r>
-          </w:p>
-        </w:tc>
-        <w:tc>
-          <w:tcPr>
-            <w:tcW w:type="dxa" w:w="2200"/>
-            <w:shd w:fill="DDDDDD" w:val="clear"/>
-          </w:tcPr>
-          <w:p>
-            <w:r>
-              <w:rPr>
-                <w:b/>
-                <w:bCs/>
-                <w:sz w:val="19"/>
-                <w:szCs w:val="19"/>
-              </w:rPr>
-              <w:t xml:space="preserve">ms/sample</w:t>
-            </w:r>
-          </w:p>
-        </w:tc>
-        <w:tc>
-          <w:tcPr>
-            <w:tcW w:type="dxa" w:w="2400"/>
-            <w:shd w:fill="DDDDDD" w:val="clear"/>
-          </w:tcPr>
-          <w:p>
-            <w:r>
-              <w:rPr>
-                <w:b/>
-                <w:bCs/>
-                <w:sz w:val="19"/>
-                <w:szCs w:val="19"/>
-              </w:rPr>
-              <w:t xml:space="preserve">Speedup vs. eager</w:t>
-            </w:r>
-          </w:p>
-        </w:tc>
-        <w:tc>
-          <w:tcPr>
-            <w:tcW w:type="dxa" w:w="2200"/>
-            <w:shd w:fill="DDDDDD" w:val="clear"/>
-          </w:tcPr>
-          <w:p>
-            <w:r>
-              <w:rPr>
-                <w:b/>
-                <w:bCs/>
-                <w:sz w:val="19"/>
-                <w:szCs w:val="19"/>
-              </w:rPr>
-              <w:t xml:space="preserve">Output diff vs. eager</w:t>
-            </w:r>
-          </w:p>
-        </w:tc>
-      </w:tr>
-      <w:tr>
-        <w:tc>
-          <w:tcPr>
-            <w:tcW w:type="dxa" w:w="2600"/>
-          </w:tcPr>
-          <w:p>
-            <w:r>
-              <w:rPr>
-                <w:b w:val="false"/>
-                <w:bCs w:val="false"/>
-                <w:sz w:val="19"/>
-                <w:szCs w:val="19"/>
-              </w:rPr>
-              <w:t xml:space="preserve">eager (fp32)</w:t>
-            </w:r>
-          </w:p>
-        </w:tc>
-        <w:tc>
-          <w:tcPr>
-            <w:tcW w:type="dxa" w:w="2200"/>
-          </w:tcPr>
-          <w:p>
-            <w:r>
-              <w:rPr>
-                <w:b w:val="false"/>
-                <w:bCs w:val="false"/>
-                <w:sz w:val="19"/>
-                <w:szCs w:val="19"/>
-              </w:rPr>
-              <w:t xml:space="preserve">2,295.0</w:t>
-            </w:r>
-          </w:p>
-        </w:tc>
-        <w:tc>
-          <w:tcPr>
-            <w:tcW w:type="dxa" w:w="2400"/>
-          </w:tcPr>
-          <w:p>
-            <w:r>
-              <w:rPr>
-                <w:b w:val="false"/>
-                <w:bCs w:val="false"/>
-                <w:sz w:val="19"/>
-                <w:szCs w:val="19"/>
-              </w:rPr>
-              <w:t xml:space="preserve">1.00x</w:t>
-            </w:r>
-          </w:p>
-        </w:tc>
-        <w:tc>
-          <w:tcPr>
-            <w:tcW w:type="dxa" w:w="2200"/>
-          </w:tcPr>
-          <w:p>
-            <w:r>
-              <w:rPr>
-                <w:b w:val="false"/>
-                <w:bCs w:val="false"/>
-                <w:sz w:val="19"/>
-                <w:szCs w:val="19"/>
-              </w:rPr>
-              <w:t xml:space="preserve">—</w:t>
-            </w:r>
-          </w:p>
-        </w:tc>
-      </w:tr>
-      <w:tr>
-        <w:tc>
-          <w:tcPr>
-            <w:tcW w:type="dxa" w:w="2600"/>
-          </w:tcPr>
-          <w:p>
-            <w:r>
-              <w:rPr>
-                <w:b w:val="false"/>
-                <w:bCs w:val="false"/>
-                <w:sz w:val="19"/>
-                <w:szCs w:val="19"/>
-              </w:rPr>
-              <w:t xml:space="preserve">torch.compile</w:t>
-            </w:r>
-          </w:p>
-        </w:tc>
-        <w:tc>
-          <w:tcPr>
-            <w:tcW w:type="dxa" w:w="2200"/>
-          </w:tcPr>
-          <w:p>
-            <w:r>
-              <w:rPr>
-                <w:b w:val="false"/>
-                <w:bCs w:val="false"/>
-                <w:sz w:val="19"/>
-                <w:szCs w:val="19"/>
-              </w:rPr>
-              <w:t xml:space="preserve">2,144.6</w:t>
-            </w:r>
-          </w:p>
-        </w:tc>
-        <w:tc>
-          <w:tcPr>
-            <w:tcW w:type="dxa" w:w="2400"/>
-          </w:tcPr>
-          <w:p>
-            <w:r>
-              <w:rPr>
-                <w:b w:val="false"/>
-                <w:bCs w:val="false"/>
-                <w:sz w:val="19"/>
-                <w:szCs w:val="19"/>
-              </w:rPr>
-              <w:t xml:space="preserve">1.07x</w:t>
-            </w:r>
-          </w:p>
-        </w:tc>
-        <w:tc>
-          <w:tcPr>
-            <w:tcW w:type="dxa" w:w="2200"/>
-          </w:tcPr>
-          <w:p>
-            <w:r>
-              <w:rPr>
-                <w:b w:val="false"/>
-                <w:bCs w:val="false"/>
-                <w:sz w:val="19"/>
-                <w:szCs w:val="19"/>
-              </w:rPr>
-              <w:t xml:space="preserve">2.0e-6</w:t>
-            </w:r>
-          </w:p>
-        </w:tc>
-      </w:tr>
-      <w:tr>
-        <w:tc>
-          <w:tcPr>
-            <w:tcW w:type="dxa" w:w="2600"/>
-          </w:tcPr>
-          <w:p>
-            <w:r>
-              <w:rPr>
-                <w:b w:val="false"/>
-                <w:bCs w:val="false"/>
-                <w:sz w:val="19"/>
-                <w:szCs w:val="19"/>
-              </w:rPr>
-              <w:t xml:space="preserve">eager + TF32</w:t>
-            </w:r>
-          </w:p>
-        </w:tc>
-        <w:tc>
-          <w:tcPr>
-            <w:tcW w:type="dxa" w:w="2200"/>
-          </w:tcPr>
-          <w:p>
-            <w:r>
-              <w:rPr>
-                <w:b w:val="false"/>
-                <w:bCs w:val="false"/>
-                <w:sz w:val="19"/>
-                <w:szCs w:val="19"/>
-              </w:rPr>
-              <w:t xml:space="preserve">486.1</w:t>
-            </w:r>
-          </w:p>
-        </w:tc>
-        <w:tc>
-          <w:tcPr>
-            <w:tcW w:type="dxa" w:w="2400"/>
-          </w:tcPr>
-          <w:p>
-            <w:r>
-              <w:rPr>
-                <w:b w:val="false"/>
-                <w:bCs w:val="false"/>
-                <w:sz w:val="19"/>
-                <w:szCs w:val="19"/>
-              </w:rPr>
-              <w:t xml:space="preserve">4.72x</w:t>
-            </w:r>
-          </w:p>
-        </w:tc>
-        <w:tc>
-          <w:tcPr>
-            <w:tcW w:type="dxa" w:w="2200"/>
-          </w:tcPr>
-          <w:p>
-            <w:r>
-              <w:rPr>
-                <w:b w:val="false"/>
-                <w:bCs w:val="false"/>
-                <w:sz w:val="19"/>
-                <w:szCs w:val="19"/>
-              </w:rPr>
-              <w:t xml:space="preserve">4.7e-3</w:t>
-            </w:r>
-          </w:p>
-        </w:tc>
-      </w:tr>
-      <w:tr>
-        <w:tc>
-          <w:tcPr>
-            <w:tcW w:type="dxa" w:w="2600"/>
-          </w:tcPr>
-          <w:p>
-            <w:r>
-              <w:rPr>
-                <w:b w:val="false"/>
-                <w:bCs w:val="false"/>
-                <w:sz w:val="19"/>
-                <w:szCs w:val="19"/>
-              </w:rPr>
-              <w:t xml:space="preserve">compile + TF32</w:t>
-            </w:r>
-          </w:p>
-        </w:tc>
-        <w:tc>
-          <w:tcPr>
-            <w:tcW w:type="dxa" w:w="2200"/>
-          </w:tcPr>
-          <w:p>
-            <w:r>
-              <w:rPr>
-                <w:b w:val="false"/>
-                <w:bCs w:val="false"/>
-                <w:sz w:val="19"/>
-                <w:szCs w:val="19"/>
-              </w:rPr>
-              <w:t xml:space="preserve">395.9</w:t>
-            </w:r>
-          </w:p>
-        </w:tc>
-        <w:tc>
-          <w:tcPr>
-            <w:tcW w:type="dxa" w:w="2400"/>
-          </w:tcPr>
-          <w:p>
-            <w:r>
-              <w:rPr>
-                <w:b w:val="false"/>
-                <w:bCs w:val="false"/>
-                <w:sz w:val="19"/>
-                <w:szCs w:val="19"/>
-              </w:rPr>
-              <w:t xml:space="preserve">5.80x</w:t>
-            </w:r>
-          </w:p>
-        </w:tc>
-        <w:tc>
-          <w:tcPr>
-            <w:tcW w:type="dxa" w:w="2200"/>
-          </w:tcPr>
-          <w:p>
-            <w:r>
-              <w:rPr>
-                <w:b w:val="false"/>
-                <w:bCs w:val="false"/>
-                <w:sz w:val="19"/>
-                <w:szCs w:val="19"/>
-              </w:rPr>
-              <w:t xml:space="preserve">4.7e-3</w:t>
-            </w:r>
-          </w:p>
-        </w:tc>
-      </w:tr>
-    </w:tbl>
-    <w:p>
-      <w:pPr>
-        <w:spacing w:after="260"/>
-      </w:pPr>
-      <w:r>
-        <w:rPr>
-          <w:i/>
-          <w:iCs/>
-          <w:sz w:val="18"/>
-          <w:szCs w:val="18"/>
-        </w:rPr>
-        <w:t xml:space="preserve">Table 3. Inference-speed optimization attempts, N=1401, batch size 1, correctness-checked against strict fp32 eager.</w:t>
+        <w:t xml:space="preserve">Table 2. Max feasible batch size and throughput, NO vs. native FEM, same GPU, corrected checkpoint.</w:t>
       </w:r>
     </w:p>
     <w:p>
@@ -1682,7 +1408,7 @@
           <w:sz w:val="18"/>
           <w:szCs w:val="18"/>
         </w:rPr>
-        <w:t xml:space="preserve">Figure 2. Same data as Table 3.</w:t>
+        <w:t xml:space="preserve">Figure 2. Throughput and peak memory vs. batch size, NO vs. FEM, own memory ceilings.</w:t>
       </w:r>
     </w:p>
     <w:p>
@@ -1690,20 +1416,459 @@
         <w:spacing w:after="160"/>
       </w:pPr>
       <w:r>
-        <w:t xml:space="preserve">TF32 matmul precision (Ampere tensor cores) gives the best result found — 5.80x combined with torch.compile — at a real but small accuracy cost, checked directly rather than assumed.</w:t>
+        <w:t xml:space="preserve">Peak throughput favors the NO by roughly 1,470x regardless of which memory budget is used to cap it — FEM's own ceiling is already below its saturation point, so giving it more memory (matching the NO's own 47.6 GB) changes nothing, while the NO barely gives anything up when capped down to FEM's much smaller 38.7 GB (4,207.75 vs. 4,203.79 samples/s). Batching helps the NO substantially (throughput rises ~20x from bs=1 to its own ceiling) while FEM barely benefits (~5x) — matching your own stated expectation directly. Re-measured with the corrected checkpoint and confirmed essentially identical to the original run — resolved, checkpoint-independent as expected.</w:t>
+      </w:r>
+    </w:p>
+    <w:p>
+      <w:pPr>
+        <w:pStyle w:val="Heading2"/>
+        <w:spacing w:after="150" w:before="300"/>
+      </w:pPr>
+      <w:r>
+        <w:t xml:space="preserve">3. NO inference optimization and profiling</w:t>
       </w:r>
     </w:p>
     <w:p>
       <w:pPr>
         <w:spacing w:after="160"/>
+      </w:pPr>
+      <w:r>
+        <w:t xml:space="preserve">Pure GPU forward-pass time after warm-up (excluding data transfer/preprocessing), fp32, batch size 1, N=1401: 2,290 ms/sample. Peak GPU memory: 23.16 GB — notably higher than our own GPU-FEM solver's peak memory at the same N (15.6-20.5 GB), so the NO is not the more memory-frugal option here either. Profiler breakdown: ~67% of time in batched matmuls (the slice-based attention operating on ~2M mesh nodes), ~22% in the MLP layers — the cost is in genuine core compute at this token count, not an obvious inefficiency.</w:t>
+      </w:r>
+    </w:p>
+    <w:tbl>
+      <w:tblPr>
+        <w:tblW w:type="dxa" w:w="9400"/>
+        <w:tblBorders>
+          <w:top w:val="single" w:color="auto" w:sz="4"/>
+          <w:left w:val="single" w:color="auto" w:sz="4"/>
+          <w:bottom w:val="single" w:color="auto" w:sz="4"/>
+          <w:right w:val="single" w:color="auto" w:sz="4"/>
+          <w:insideH w:val="single" w:color="auto" w:sz="4"/>
+          <w:insideV w:val="single" w:color="auto" w:sz="4"/>
+        </w:tblBorders>
+      </w:tblPr>
+      <w:tblGrid>
+        <w:gridCol w:w="2600"/>
+        <w:gridCol w:w="2200"/>
+        <w:gridCol w:w="2400"/>
+        <w:gridCol w:w="2200"/>
+      </w:tblGrid>
+      <w:tr>
+        <w:tc>
+          <w:tcPr>
+            <w:tcW w:type="dxa" w:w="2600"/>
+            <w:shd w:fill="DDDDDD" w:val="clear"/>
+          </w:tcPr>
+          <w:p>
+            <w:r>
+              <w:rPr>
+                <w:b/>
+                <w:bCs/>
+                <w:sz w:val="19"/>
+                <w:szCs w:val="19"/>
+              </w:rPr>
+              <w:t xml:space="preserve">Variant</w:t>
+            </w:r>
+          </w:p>
+        </w:tc>
+        <w:tc>
+          <w:tcPr>
+            <w:tcW w:type="dxa" w:w="2200"/>
+            <w:shd w:fill="DDDDDD" w:val="clear"/>
+          </w:tcPr>
+          <w:p>
+            <w:r>
+              <w:rPr>
+                <w:b/>
+                <w:bCs/>
+                <w:sz w:val="19"/>
+                <w:szCs w:val="19"/>
+              </w:rPr>
+              <w:t xml:space="preserve">ms/sample</w:t>
+            </w:r>
+          </w:p>
+        </w:tc>
+        <w:tc>
+          <w:tcPr>
+            <w:tcW w:type="dxa" w:w="2400"/>
+            <w:shd w:fill="DDDDDD" w:val="clear"/>
+          </w:tcPr>
+          <w:p>
+            <w:r>
+              <w:rPr>
+                <w:b/>
+                <w:bCs/>
+                <w:sz w:val="19"/>
+                <w:szCs w:val="19"/>
+              </w:rPr>
+              <w:t xml:space="preserve">Speedup vs. eager</w:t>
+            </w:r>
+          </w:p>
+        </w:tc>
+        <w:tc>
+          <w:tcPr>
+            <w:tcW w:type="dxa" w:w="2200"/>
+            <w:shd w:fill="DDDDDD" w:val="clear"/>
+          </w:tcPr>
+          <w:p>
+            <w:r>
+              <w:rPr>
+                <w:b/>
+                <w:bCs/>
+                <w:sz w:val="19"/>
+                <w:szCs w:val="19"/>
+              </w:rPr>
+              <w:t xml:space="preserve">Output diff vs. eager</w:t>
+            </w:r>
+          </w:p>
+        </w:tc>
+      </w:tr>
+      <w:tr>
+        <w:tc>
+          <w:tcPr>
+            <w:tcW w:type="dxa" w:w="2600"/>
+          </w:tcPr>
+          <w:p>
+            <w:r>
+              <w:rPr>
+                <w:b w:val="false"/>
+                <w:bCs w:val="false"/>
+                <w:sz w:val="19"/>
+                <w:szCs w:val="19"/>
+              </w:rPr>
+              <w:t xml:space="preserve">eager (fp32)</w:t>
+            </w:r>
+          </w:p>
+        </w:tc>
+        <w:tc>
+          <w:tcPr>
+            <w:tcW w:type="dxa" w:w="2200"/>
+          </w:tcPr>
+          <w:p>
+            <w:r>
+              <w:rPr>
+                <w:b w:val="false"/>
+                <w:bCs w:val="false"/>
+                <w:sz w:val="19"/>
+                <w:szCs w:val="19"/>
+              </w:rPr>
+              <w:t xml:space="preserve">2,292.1</w:t>
+            </w:r>
+          </w:p>
+        </w:tc>
+        <w:tc>
+          <w:tcPr>
+            <w:tcW w:type="dxa" w:w="2400"/>
+          </w:tcPr>
+          <w:p>
+            <w:r>
+              <w:rPr>
+                <w:b w:val="false"/>
+                <w:bCs w:val="false"/>
+                <w:sz w:val="19"/>
+                <w:szCs w:val="19"/>
+              </w:rPr>
+              <w:t xml:space="preserve">1.00x</w:t>
+            </w:r>
+          </w:p>
+        </w:tc>
+        <w:tc>
+          <w:tcPr>
+            <w:tcW w:type="dxa" w:w="2200"/>
+          </w:tcPr>
+          <w:p>
+            <w:r>
+              <w:rPr>
+                <w:b w:val="false"/>
+                <w:bCs w:val="false"/>
+                <w:sz w:val="19"/>
+                <w:szCs w:val="19"/>
+              </w:rPr>
+              <w:t xml:space="preserve">—</w:t>
+            </w:r>
+          </w:p>
+        </w:tc>
+      </w:tr>
+      <w:tr>
+        <w:tc>
+          <w:tcPr>
+            <w:tcW w:type="dxa" w:w="2600"/>
+          </w:tcPr>
+          <w:p>
+            <w:r>
+              <w:rPr>
+                <w:b w:val="false"/>
+                <w:bCs w:val="false"/>
+                <w:sz w:val="19"/>
+                <w:szCs w:val="19"/>
+              </w:rPr>
+              <w:t xml:space="preserve">torch.compile</w:t>
+            </w:r>
+          </w:p>
+        </w:tc>
+        <w:tc>
+          <w:tcPr>
+            <w:tcW w:type="dxa" w:w="2200"/>
+          </w:tcPr>
+          <w:p>
+            <w:r>
+              <w:rPr>
+                <w:b w:val="false"/>
+                <w:bCs w:val="false"/>
+                <w:sz w:val="19"/>
+                <w:szCs w:val="19"/>
+              </w:rPr>
+              <w:t xml:space="preserve">2,145.1</w:t>
+            </w:r>
+          </w:p>
+        </w:tc>
+        <w:tc>
+          <w:tcPr>
+            <w:tcW w:type="dxa" w:w="2400"/>
+          </w:tcPr>
+          <w:p>
+            <w:r>
+              <w:rPr>
+                <w:b w:val="false"/>
+                <w:bCs w:val="false"/>
+                <w:sz w:val="19"/>
+                <w:szCs w:val="19"/>
+              </w:rPr>
+              <w:t xml:space="preserve">1.07x</w:t>
+            </w:r>
+          </w:p>
+        </w:tc>
+        <w:tc>
+          <w:tcPr>
+            <w:tcW w:type="dxa" w:w="2200"/>
+          </w:tcPr>
+          <w:p>
+            <w:r>
+              <w:rPr>
+                <w:b w:val="false"/>
+                <w:bCs w:val="false"/>
+                <w:sz w:val="19"/>
+                <w:szCs w:val="19"/>
+              </w:rPr>
+              <w:t xml:space="preserve">6.0e-7</w:t>
+            </w:r>
+          </w:p>
+        </w:tc>
+      </w:tr>
+      <w:tr>
+        <w:tc>
+          <w:tcPr>
+            <w:tcW w:type="dxa" w:w="2600"/>
+          </w:tcPr>
+          <w:p>
+            <w:r>
+              <w:rPr>
+                <w:b w:val="false"/>
+                <w:bCs w:val="false"/>
+                <w:sz w:val="19"/>
+                <w:szCs w:val="19"/>
+              </w:rPr>
+              <w:t xml:space="preserve">eager + TF32</w:t>
+            </w:r>
+          </w:p>
+        </w:tc>
+        <w:tc>
+          <w:tcPr>
+            <w:tcW w:type="dxa" w:w="2200"/>
+          </w:tcPr>
+          <w:p>
+            <w:r>
+              <w:rPr>
+                <w:b w:val="false"/>
+                <w:bCs w:val="false"/>
+                <w:sz w:val="19"/>
+                <w:szCs w:val="19"/>
+              </w:rPr>
+              <w:t xml:space="preserve">491.2</w:t>
+            </w:r>
+          </w:p>
+        </w:tc>
+        <w:tc>
+          <w:tcPr>
+            <w:tcW w:type="dxa" w:w="2400"/>
+          </w:tcPr>
+          <w:p>
+            <w:r>
+              <w:rPr>
+                <w:b w:val="false"/>
+                <w:bCs w:val="false"/>
+                <w:sz w:val="19"/>
+                <w:szCs w:val="19"/>
+              </w:rPr>
+              <w:t xml:space="preserve">4.67x</w:t>
+            </w:r>
+          </w:p>
+        </w:tc>
+        <w:tc>
+          <w:tcPr>
+            <w:tcW w:type="dxa" w:w="2200"/>
+          </w:tcPr>
+          <w:p>
+            <w:r>
+              <w:rPr>
+                <w:b w:val="false"/>
+                <w:bCs w:val="false"/>
+                <w:sz w:val="19"/>
+                <w:szCs w:val="19"/>
+              </w:rPr>
+              <w:t xml:space="preserve">3.2e-3</w:t>
+            </w:r>
+          </w:p>
+        </w:tc>
+      </w:tr>
+      <w:tr>
+        <w:tc>
+          <w:tcPr>
+            <w:tcW w:type="dxa" w:w="2600"/>
+          </w:tcPr>
+          <w:p>
+            <w:r>
+              <w:rPr>
+                <w:b w:val="false"/>
+                <w:bCs w:val="false"/>
+                <w:sz w:val="19"/>
+                <w:szCs w:val="19"/>
+              </w:rPr>
+              <w:t xml:space="preserve">compile + TF32</w:t>
+            </w:r>
+          </w:p>
+        </w:tc>
+        <w:tc>
+          <w:tcPr>
+            <w:tcW w:type="dxa" w:w="2200"/>
+          </w:tcPr>
+          <w:p>
+            <w:r>
+              <w:rPr>
+                <w:b w:val="false"/>
+                <w:bCs w:val="false"/>
+                <w:sz w:val="19"/>
+                <w:szCs w:val="19"/>
+              </w:rPr>
+              <w:t xml:space="preserve">394.0</w:t>
+            </w:r>
+          </w:p>
+        </w:tc>
+        <w:tc>
+          <w:tcPr>
+            <w:tcW w:type="dxa" w:w="2400"/>
+          </w:tcPr>
+          <w:p>
+            <w:r>
+              <w:rPr>
+                <w:b w:val="false"/>
+                <w:bCs w:val="false"/>
+                <w:sz w:val="19"/>
+                <w:szCs w:val="19"/>
+              </w:rPr>
+              <w:t xml:space="preserve">5.82x</w:t>
+            </w:r>
+          </w:p>
+        </w:tc>
+        <w:tc>
+          <w:tcPr>
+            <w:tcW w:type="dxa" w:w="2200"/>
+          </w:tcPr>
+          <w:p>
+            <w:r>
+              <w:rPr>
+                <w:b w:val="false"/>
+                <w:bCs w:val="false"/>
+                <w:sz w:val="19"/>
+                <w:szCs w:val="19"/>
+              </w:rPr>
+              <w:t xml:space="preserve">3.2e-3</w:t>
+            </w:r>
+          </w:p>
+        </w:tc>
+      </w:tr>
+    </w:tbl>
+    <w:p>
+      <w:pPr>
+        <w:spacing w:after="260"/>
       </w:pPr>
       <w:r>
         <w:rPr>
           <w:i/>
           <w:iCs/>
-          <w:color w:val="C00000"/>
+          <w:sz w:val="18"/>
+          <w:szCs w:val="18"/>
         </w:rPr>
-        <w:t xml:space="preserve">[Same caveat as point 2: measured with the pre-fix checkpoint; expected but not yet re-confirmed to be checkpoint-independent.]</w:t>
+        <w:t xml:space="preserve">Table 3. Inference-speed optimization attempts, N=1401, batch size 1, correctness-checked against strict fp32 eager. Re-measured with the corrected checkpoint -- essentially identical to the original run, confirming timing/speedup is checkpoint-independent as expected.</w:t>
+      </w:r>
+    </w:p>
+    <w:p>
+      <w:pPr>
+        <w:spacing w:after="60" w:before="120"/>
+        <w:jc w:val="center"/>
+      </w:pPr>
+      <w:r>
+        <w:drawing>
+          <wp:inline distT="0" distB="0" distL="0" distR="0">
+            <wp:extent cx="4572000" cy="2943225"/>
+            <wp:effectExtent t="0" r="0" b="0" l="0"/>
+            <wp:docPr id="1" name="" descr="" title=""/>
+            <wp:cNvGraphicFramePr>
+              <a:graphicFrameLocks xmlns:a="http://schemas.openxmlformats.org/drawingml/2006/main" noChangeAspect="1"/>
+            </wp:cNvGraphicFramePr>
+            <a:graphic xmlns:a="http://schemas.openxmlformats.org/drawingml/2006/main">
+              <a:graphicData uri="http://schemas.openxmlformats.org/drawingml/2006/picture">
+                <pic:pic xmlns:pic="http://schemas.openxmlformats.org/drawingml/2006/picture">
+                  <pic:nvPicPr>
+                    <pic:cNvPr id="0" name="" descr=""/>
+                    <pic:cNvPicPr>
+                      <a:picLocks noChangeAspect="1" noChangeArrowheads="1"/>
+                    </pic:cNvPicPr>
+                  </pic:nvPicPr>
+                  <pic:blipFill>
+                    <a:blip r:embed="rId9" cstate="none"/>
+                    <a:srcRect/>
+                    <a:stretch>
+                      <a:fillRect/>
+                    </a:stretch>
+                  </pic:blipFill>
+                  <pic:spPr bwMode="auto">
+                    <a:xfrm>
+                      <a:off x="0" y="0"/>
+                      <a:ext cx="4572000" cy="2943225"/>
+                    </a:xfrm>
+                    <a:prstGeom prst="rect">
+                      <a:avLst/>
+                    </a:prstGeom>
+                  </pic:spPr>
+                </pic:pic>
+              </a:graphicData>
+            </a:graphic>
+          </wp:inline>
+        </w:drawing>
+      </w:r>
+    </w:p>
+    <w:p>
+      <w:pPr>
+        <w:spacing w:after="260"/>
+      </w:pPr>
+      <w:r>
+        <w:rPr>
+          <w:i/>
+          <w:iCs/>
+          <w:sz w:val="18"/>
+          <w:szCs w:val="18"/>
+        </w:rPr>
+        <w:t xml:space="preserve">Figure 3. Same data as Table 3 (re-measured, corrected checkpoint).</w:t>
+      </w:r>
+    </w:p>
+    <w:p>
+      <w:pPr>
+        <w:spacing w:after="160"/>
+      </w:pPr>
+      <w:r>
+        <w:t xml:space="preserve">TF32 matmul precision (Ampere tensor cores) gives the best result found — 5.82x combined with torch.compile — at a real but small accuracy cost, checked directly rather than assumed.</w:t>
       </w:r>
     </w:p>
     <w:p>
@@ -2054,7 +2219,7 @@
         <w:spacing w:after="160"/>
       </w:pPr>
       <w:r>
-        <w:t xml:space="preserve">Let me know if the framing above looks right, particularly on point 1's stress-singularity caveat, the checkpoint caveat on points 2-3, and on point 4.</w:t>
+        <w:t xml:space="preserve">Let me know if the framing above looks right, particularly on point 1's stress-singularity caveat and on point 4.</w:t>
       </w:r>
     </w:p>
     <w:p>

</xml_diff>

<commit_message>
Finalize Timon round-10 reply draft with retrained-checkpoint and break-even results
Point 1 rewritten with the before/after retraining table (44.65% -> 5.85%
at N=1401) and the peak-stress crossover flip (coarsest suitable FEM now
N=9-17, bound by tangent energy). Point 5 rewritten with the real
accuracy-matched break-even (eager never breaks even; compile+TF32 breaks
even after 34,005 samples). Both .md and .docx updated and verified;
all five of Timon's round-10 points are now numerically complete and
reflected in the draft text.

Co-Authored-By: Claude Sonnet 5 <noreply@anthropic.com>
Claude-Session: https://claude.ai/code/session_01HX6Lr5YENQbEkvto9y2AB8
</commit_message>
<xml_diff>
--- a/advisor_feedback/2026-09-13_reply_to_round10_draft.docx
+++ b/advisor_feedback/2026-09-13_reply_to_round10_draft.docx
@@ -20,7 +20,7 @@
           <w:i/>
           <w:iCs/>
         </w:rPr>
-        <w:t xml:space="preserve">Review before sending. Two things to decide first:</w:t>
+        <w:t xml:space="preserve">Review before sending. All five points are now numerically complete and verified with real GPU results, including a finished multi-resolution retraining that substantially improved point 1's story and a real accuracy-matched break-even for point 5. One thing to decide:</w:t>
       </w:r>
     </w:p>
     <w:p>
@@ -32,31 +32,7 @@
           <w:i/>
           <w:iCs/>
         </w:rPr>
-        <w:t xml:space="preserve">1. Point 1's numbers are real and verified, but a retraining run is in progress to see if a wider training-resolution range closes some of the gap — you may want to wait for that before sending, or send now and follow up separately once it's done. The draft below sends now and says a follow-up is coming.</w:t>
-      </w:r>
-    </w:p>
-    <w:p>
-      <w:pPr>
-        <w:spacing w:after="160"/>
-      </w:pPr>
-      <w:r>
-        <w:rPr>
-          <w:i/>
-          <w:iCs/>
-        </w:rPr>
-        <w:t xml:space="preserve">2. Point 4 asks Timon a direct question (confirm the B7 design) — this IS the "ask Timon first" step from PROJECT_STATUS.md's own standing rule. Sending this email is what discharges that requirement.</w:t>
-      </w:r>
-    </w:p>
-    <w:p>
-      <w:pPr>
-        <w:spacing w:after="160"/>
-      </w:pPr>
-      <w:r>
-        <w:rPr>
-          <w:i/>
-          <w:iCs/>
-        </w:rPr>
-        <w:t xml:space="preserve">3. Points 2 and 3 were both re-measured with the corrected checkpoint and confirmed essentially identical to the original (wrong-checkpoint) measurement in both cases — both resolved, no caveats remain.</w:t>
+        <w:t xml:space="preserve">Point 4 asks Timon a direct question (confirm the B7 design) — this IS the "ask Timon first" step from PROJECT_STATUS.md's own standing rule. Sending this email is what discharges that requirement.</w:t>
       </w:r>
     </w:p>
     <w:p>
@@ -117,7 +93,7 @@
         <w:spacing w:after="160"/>
       </w:pPr>
       <w:r>
-        <w:t xml:space="preserve">The NO's own accuracy at N=1401, checked directly against a real FEM ground truth there for the first time: displacement relative L2 error 44.65% (L2-norm 39.49%, H1 semi-norm 61.16%). This degrades smoothly and monotonically away from the trained resolutions — best at N=33/37 (≈7.4%), rising to 8.5% at N=49, 15.0% at N=101, and up to the N=1401 number above. Ground truth convergence was confirmed at every single resolution tested (relative residual 1.8e-11 to 1.0e-10 throughout).</w:t>
+        <w:t xml:space="preserve">Along the way we found and fixed a checkpoint-loading bug that had caused the round-10 accuracy numbers to be measured against the wrong model at one point; every number below is from the corrected, fingerprint-verified checkpoint. We also went one step further: given that accuracy degraded away from the original training resolutions (N=21, 33), we retrained a new checkpoint on a wider spread (N=21, 33, 101, 201) to test whether that gap was addressable. It was, dramatically:</w:t>
       </w:r>
     </w:p>
     <w:tbl>
@@ -133,15 +109,14 @@
         </w:tblBorders>
       </w:tblPr>
       <w:tblGrid>
-        <w:gridCol w:w="1500"/>
-        <w:gridCol w:w="2500"/>
-        <w:gridCol w:w="2500"/>
-        <w:gridCol w:w="2900"/>
+        <w:gridCol w:w="1800"/>
+        <w:gridCol w:w="3800"/>
+        <w:gridCol w:w="3800"/>
       </w:tblGrid>
       <w:tr>
         <w:tc>
           <w:tcPr>
-            <w:tcW w:type="dxa" w:w="1500"/>
+            <w:tcW w:type="dxa" w:w="1800"/>
             <w:shd w:fill="DDDDDD" w:val="clear"/>
           </w:tcPr>
           <w:p>
@@ -158,7 +133,7 @@
         </w:tc>
         <w:tc>
           <w:tcPr>
-            <w:tcW w:type="dxa" w:w="2500"/>
+            <w:tcW w:type="dxa" w:w="3800"/>
             <w:shd w:fill="DDDDDD" w:val="clear"/>
           </w:tcPr>
           <w:p>
@@ -169,13 +144,13 @@
                 <w:sz w:val="19"/>
                 <w:szCs w:val="19"/>
               </w:rPr>
-              <w:t xml:space="preserve">disp_rel_L2</w:t>
-            </w:r>
-          </w:p>
-        </w:tc>
-        <w:tc>
-          <w:tcPr>
-            <w:tcW w:type="dxa" w:w="2500"/>
+              <w:t xml:space="preserve">Original checkpoint (N=21,33 only)</w:t>
+            </w:r>
+          </w:p>
+        </w:tc>
+        <w:tc>
+          <w:tcPr>
+            <w:tcW w:type="dxa" w:w="3800"/>
             <w:shd w:fill="DDDDDD" w:val="clear"/>
           </w:tcPr>
           <w:p>
@@ -186,24 +161,7 @@
                 <w:sz w:val="19"/>
                 <w:szCs w:val="19"/>
               </w:rPr>
-              <w:t xml:space="preserve">L2_rel</w:t>
-            </w:r>
-          </w:p>
-        </w:tc>
-        <w:tc>
-          <w:tcPr>
-            <w:tcW w:type="dxa" w:w="2900"/>
-            <w:shd w:fill="DDDDDD" w:val="clear"/>
-          </w:tcPr>
-          <w:p>
-            <w:r>
-              <w:rPr>
-                <w:b/>
-                <w:bCs/>
-                <w:sz w:val="19"/>
-                <w:szCs w:val="19"/>
-              </w:rPr>
-              <w:t xml:space="preserve">H1_semi_rel</w:t>
+              <w:t xml:space="preserve">Retrained (N=21,33,101,201)</w:t>
             </w:r>
           </w:p>
         </w:tc>
@@ -211,7 +169,7 @@
       <w:tr>
         <w:tc>
           <w:tcPr>
-            <w:tcW w:type="dxa" w:w="1500"/>
+            <w:tcW w:type="dxa" w:w="1800"/>
           </w:tcPr>
           <w:p>
             <w:r>
@@ -227,7 +185,7 @@
         </w:tc>
         <w:tc>
           <w:tcPr>
-            <w:tcW w:type="dxa" w:w="2500"/>
+            <w:tcW w:type="dxa" w:w="3800"/>
           </w:tcPr>
           <w:p>
             <w:r>
@@ -243,33 +201,17 @@
         </w:tc>
         <w:tc>
           <w:tcPr>
-            <w:tcW w:type="dxa" w:w="2500"/>
-          </w:tcPr>
-          <w:p>
-            <w:r>
-              <w:rPr>
-                <w:b w:val="false"/>
-                <w:bCs w:val="false"/>
-                <w:sz w:val="19"/>
-                <w:szCs w:val="19"/>
-              </w:rPr>
-              <w:t xml:space="preserve">6.58%</w:t>
-            </w:r>
-          </w:p>
-        </w:tc>
-        <w:tc>
-          <w:tcPr>
-            <w:tcW w:type="dxa" w:w="2900"/>
-          </w:tcPr>
-          <w:p>
-            <w:r>
-              <w:rPr>
-                <w:b w:val="false"/>
-                <w:bCs w:val="false"/>
-                <w:sz w:val="19"/>
-                <w:szCs w:val="19"/>
-              </w:rPr>
-              <w:t xml:space="preserve">20.43%</w:t>
+            <w:tcW w:type="dxa" w:w="3800"/>
+          </w:tcPr>
+          <w:p>
+            <w:r>
+              <w:rPr>
+                <w:b w:val="false"/>
+                <w:bCs w:val="false"/>
+                <w:sz w:val="19"/>
+                <w:szCs w:val="19"/>
+              </w:rPr>
+              <w:t xml:space="preserve">11.74%</w:t>
             </w:r>
           </w:p>
         </w:tc>
@@ -277,65 +219,49 @@
       <w:tr>
         <w:tc>
           <w:tcPr>
-            <w:tcW w:type="dxa" w:w="1500"/>
-          </w:tcPr>
-          <w:p>
-            <w:r>
-              <w:rPr>
-                <w:b w:val="false"/>
-                <w:bCs w:val="false"/>
-                <w:sz w:val="19"/>
-                <w:szCs w:val="19"/>
-              </w:rPr>
-              <w:t xml:space="preserve">21</w:t>
-            </w:r>
-          </w:p>
-        </w:tc>
-        <w:tc>
-          <w:tcPr>
-            <w:tcW w:type="dxa" w:w="2500"/>
-          </w:tcPr>
-          <w:p>
-            <w:r>
-              <w:rPr>
-                <w:b w:val="false"/>
-                <w:bCs w:val="false"/>
-                <w:sz w:val="19"/>
-                <w:szCs w:val="19"/>
-              </w:rPr>
-              <w:t xml:space="preserve">9.75%</w:t>
-            </w:r>
-          </w:p>
-        </w:tc>
-        <w:tc>
-          <w:tcPr>
-            <w:tcW w:type="dxa" w:w="2500"/>
-          </w:tcPr>
-          <w:p>
-            <w:r>
-              <w:rPr>
-                <w:b w:val="false"/>
-                <w:bCs w:val="false"/>
-                <w:sz w:val="19"/>
-                <w:szCs w:val="19"/>
-              </w:rPr>
-              <w:t xml:space="preserve">4.78%</w:t>
-            </w:r>
-          </w:p>
-        </w:tc>
-        <w:tc>
-          <w:tcPr>
-            <w:tcW w:type="dxa" w:w="2900"/>
-          </w:tcPr>
-          <w:p>
-            <w:r>
-              <w:rPr>
-                <w:b w:val="false"/>
-                <w:bCs w:val="false"/>
-                <w:sz w:val="19"/>
-                <w:szCs w:val="19"/>
-              </w:rPr>
-              <w:t xml:space="preserve">17.11%</w:t>
+            <w:tcW w:type="dxa" w:w="1800"/>
+          </w:tcPr>
+          <w:p>
+            <w:r>
+              <w:rPr>
+                <w:b w:val="false"/>
+                <w:bCs w:val="false"/>
+                <w:sz w:val="19"/>
+                <w:szCs w:val="19"/>
+              </w:rPr>
+              <w:t xml:space="preserve">33</w:t>
+            </w:r>
+          </w:p>
+        </w:tc>
+        <w:tc>
+          <w:tcPr>
+            <w:tcW w:type="dxa" w:w="3800"/>
+          </w:tcPr>
+          <w:p>
+            <w:r>
+              <w:rPr>
+                <w:b w:val="false"/>
+                <w:bCs w:val="false"/>
+                <w:sz w:val="19"/>
+                <w:szCs w:val="19"/>
+              </w:rPr>
+              <w:t xml:space="preserve">7.37%</w:t>
+            </w:r>
+          </w:p>
+        </w:tc>
+        <w:tc>
+          <w:tcPr>
+            <w:tcW w:type="dxa" w:w="3800"/>
+          </w:tcPr>
+          <w:p>
+            <w:r>
+              <w:rPr>
+                <w:b w:val="false"/>
+                <w:bCs w:val="false"/>
+                <w:sz w:val="19"/>
+                <w:szCs w:val="19"/>
+              </w:rPr>
+              <w:t xml:space="preserve">3.50%</w:t>
             </w:r>
           </w:p>
         </w:tc>
@@ -343,65 +269,49 @@
       <w:tr>
         <w:tc>
           <w:tcPr>
-            <w:tcW w:type="dxa" w:w="1500"/>
-          </w:tcPr>
-          <w:p>
-            <w:r>
-              <w:rPr>
-                <w:b w:val="false"/>
-                <w:bCs w:val="false"/>
-                <w:sz w:val="19"/>
-                <w:szCs w:val="19"/>
-              </w:rPr>
-              <w:t xml:space="preserve">33</w:t>
-            </w:r>
-          </w:p>
-        </w:tc>
-        <w:tc>
-          <w:tcPr>
-            <w:tcW w:type="dxa" w:w="2500"/>
-          </w:tcPr>
-          <w:p>
-            <w:r>
-              <w:rPr>
-                <w:b w:val="false"/>
-                <w:bCs w:val="false"/>
-                <w:sz w:val="19"/>
-                <w:szCs w:val="19"/>
-              </w:rPr>
-              <w:t xml:space="preserve">7.37%</w:t>
-            </w:r>
-          </w:p>
-        </w:tc>
-        <w:tc>
-          <w:tcPr>
-            <w:tcW w:type="dxa" w:w="2500"/>
-          </w:tcPr>
-          <w:p>
-            <w:r>
-              <w:rPr>
-                <w:b w:val="false"/>
-                <w:bCs w:val="false"/>
-                <w:sz w:val="19"/>
-                <w:szCs w:val="19"/>
-              </w:rPr>
-              <w:t xml:space="preserve">3.81%</w:t>
-            </w:r>
-          </w:p>
-        </w:tc>
-        <w:tc>
-          <w:tcPr>
-            <w:tcW w:type="dxa" w:w="2900"/>
-          </w:tcPr>
-          <w:p>
-            <w:r>
-              <w:rPr>
-                <w:b w:val="false"/>
-                <w:bCs w:val="false"/>
-                <w:sz w:val="19"/>
-                <w:szCs w:val="19"/>
-              </w:rPr>
-              <w:t xml:space="preserve">14.30%</w:t>
+            <w:tcW w:type="dxa" w:w="1800"/>
+          </w:tcPr>
+          <w:p>
+            <w:r>
+              <w:rPr>
+                <w:b w:val="false"/>
+                <w:bCs w:val="false"/>
+                <w:sz w:val="19"/>
+                <w:szCs w:val="19"/>
+              </w:rPr>
+              <w:t xml:space="preserve">49</w:t>
+            </w:r>
+          </w:p>
+        </w:tc>
+        <w:tc>
+          <w:tcPr>
+            <w:tcW w:type="dxa" w:w="3800"/>
+          </w:tcPr>
+          <w:p>
+            <w:r>
+              <w:rPr>
+                <w:b w:val="false"/>
+                <w:bCs w:val="false"/>
+                <w:sz w:val="19"/>
+                <w:szCs w:val="19"/>
+              </w:rPr>
+              <w:t xml:space="preserve">8.50%</w:t>
+            </w:r>
+          </w:p>
+        </w:tc>
+        <w:tc>
+          <w:tcPr>
+            <w:tcW w:type="dxa" w:w="3800"/>
+          </w:tcPr>
+          <w:p>
+            <w:r>
+              <w:rPr>
+                <w:b w:val="false"/>
+                <w:bCs w:val="false"/>
+                <w:sz w:val="19"/>
+                <w:szCs w:val="19"/>
+              </w:rPr>
+              <w:t xml:space="preserve">2.32%</w:t>
             </w:r>
           </w:p>
         </w:tc>
@@ -409,65 +319,49 @@
       <w:tr>
         <w:tc>
           <w:tcPr>
-            <w:tcW w:type="dxa" w:w="1500"/>
-          </w:tcPr>
-          <w:p>
-            <w:r>
-              <w:rPr>
-                <w:b w:val="false"/>
-                <w:bCs w:val="false"/>
-                <w:sz w:val="19"/>
-                <w:szCs w:val="19"/>
-              </w:rPr>
-              <w:t xml:space="preserve">49</w:t>
-            </w:r>
-          </w:p>
-        </w:tc>
-        <w:tc>
-          <w:tcPr>
-            <w:tcW w:type="dxa" w:w="2500"/>
-          </w:tcPr>
-          <w:p>
-            <w:r>
-              <w:rPr>
-                <w:b w:val="false"/>
-                <w:bCs w:val="false"/>
-                <w:sz w:val="19"/>
-                <w:szCs w:val="19"/>
-              </w:rPr>
-              <w:t xml:space="preserve">8.50%</w:t>
-            </w:r>
-          </w:p>
-        </w:tc>
-        <w:tc>
-          <w:tcPr>
-            <w:tcW w:type="dxa" w:w="2500"/>
-          </w:tcPr>
-          <w:p>
-            <w:r>
-              <w:rPr>
-                <w:b w:val="false"/>
-                <w:bCs w:val="false"/>
-                <w:sz w:val="19"/>
-                <w:szCs w:val="19"/>
-              </w:rPr>
-              <w:t xml:space="preserve">5.07%</w:t>
-            </w:r>
-          </w:p>
-        </w:tc>
-        <w:tc>
-          <w:tcPr>
-            <w:tcW w:type="dxa" w:w="2900"/>
-          </w:tcPr>
-          <w:p>
-            <w:r>
-              <w:rPr>
-                <w:b w:val="false"/>
-                <w:bCs w:val="false"/>
-                <w:sz w:val="19"/>
-                <w:szCs w:val="19"/>
-              </w:rPr>
-              <w:t xml:space="preserve">14.07%</w:t>
+            <w:tcW w:type="dxa" w:w="1800"/>
+          </w:tcPr>
+          <w:p>
+            <w:r>
+              <w:rPr>
+                <w:b w:val="false"/>
+                <w:bCs w:val="false"/>
+                <w:sz w:val="19"/>
+                <w:szCs w:val="19"/>
+              </w:rPr>
+              <w:t xml:space="preserve">101</w:t>
+            </w:r>
+          </w:p>
+        </w:tc>
+        <w:tc>
+          <w:tcPr>
+            <w:tcW w:type="dxa" w:w="3800"/>
+          </w:tcPr>
+          <w:p>
+            <w:r>
+              <w:rPr>
+                <w:b w:val="false"/>
+                <w:bCs w:val="false"/>
+                <w:sz w:val="19"/>
+                <w:szCs w:val="19"/>
+              </w:rPr>
+              <w:t xml:space="preserve">14.99%</w:t>
+            </w:r>
+          </w:p>
+        </w:tc>
+        <w:tc>
+          <w:tcPr>
+            <w:tcW w:type="dxa" w:w="3800"/>
+          </w:tcPr>
+          <w:p>
+            <w:r>
+              <w:rPr>
+                <w:b w:val="false"/>
+                <w:bCs w:val="false"/>
+                <w:sz w:val="19"/>
+                <w:szCs w:val="19"/>
+              </w:rPr>
+              <w:t xml:space="preserve">3.55%</w:t>
             </w:r>
           </w:p>
         </w:tc>
@@ -475,65 +369,49 @@
       <w:tr>
         <w:tc>
           <w:tcPr>
-            <w:tcW w:type="dxa" w:w="1500"/>
-          </w:tcPr>
-          <w:p>
-            <w:r>
-              <w:rPr>
-                <w:b w:val="false"/>
-                <w:bCs w:val="false"/>
-                <w:sz w:val="19"/>
-                <w:szCs w:val="19"/>
-              </w:rPr>
-              <w:t xml:space="preserve">101</w:t>
-            </w:r>
-          </w:p>
-        </w:tc>
-        <w:tc>
-          <w:tcPr>
-            <w:tcW w:type="dxa" w:w="2500"/>
-          </w:tcPr>
-          <w:p>
-            <w:r>
-              <w:rPr>
-                <w:b w:val="false"/>
-                <w:bCs w:val="false"/>
-                <w:sz w:val="19"/>
-                <w:szCs w:val="19"/>
-              </w:rPr>
-              <w:t xml:space="preserve">14.99%</w:t>
-            </w:r>
-          </w:p>
-        </w:tc>
-        <w:tc>
-          <w:tcPr>
-            <w:tcW w:type="dxa" w:w="2500"/>
-          </w:tcPr>
-          <w:p>
-            <w:r>
-              <w:rPr>
-                <w:b w:val="false"/>
-                <w:bCs w:val="false"/>
-                <w:sz w:val="19"/>
-                <w:szCs w:val="19"/>
-              </w:rPr>
-              <w:t xml:space="preserve">10.91%</w:t>
-            </w:r>
-          </w:p>
-        </w:tc>
-        <w:tc>
-          <w:tcPr>
-            <w:tcW w:type="dxa" w:w="2900"/>
-          </w:tcPr>
-          <w:p>
-            <w:r>
-              <w:rPr>
-                <w:b w:val="false"/>
-                <w:bCs w:val="false"/>
-                <w:sz w:val="19"/>
-                <w:szCs w:val="19"/>
-              </w:rPr>
-              <w:t xml:space="preserve">19.99%</w:t>
+            <w:tcW w:type="dxa" w:w="1800"/>
+          </w:tcPr>
+          <w:p>
+            <w:r>
+              <w:rPr>
+                <w:b w:val="false"/>
+                <w:bCs w:val="false"/>
+                <w:sz w:val="19"/>
+                <w:szCs w:val="19"/>
+              </w:rPr>
+              <w:t xml:space="preserve">201</w:t>
+            </w:r>
+          </w:p>
+        </w:tc>
+        <w:tc>
+          <w:tcPr>
+            <w:tcW w:type="dxa" w:w="3800"/>
+          </w:tcPr>
+          <w:p>
+            <w:r>
+              <w:rPr>
+                <w:b w:val="false"/>
+                <w:bCs w:val="false"/>
+                <w:sz w:val="19"/>
+                <w:szCs w:val="19"/>
+              </w:rPr>
+              <w:t xml:space="preserve">22.28%</w:t>
+            </w:r>
+          </w:p>
+        </w:tc>
+        <w:tc>
+          <w:tcPr>
+            <w:tcW w:type="dxa" w:w="3800"/>
+          </w:tcPr>
+          <w:p>
+            <w:r>
+              <w:rPr>
+                <w:b w:val="false"/>
+                <w:bCs w:val="false"/>
+                <w:sz w:val="19"/>
+                <w:szCs w:val="19"/>
+              </w:rPr>
+              <w:t xml:space="preserve">4.85%</w:t>
             </w:r>
           </w:p>
         </w:tc>
@@ -541,65 +419,49 @@
       <w:tr>
         <w:tc>
           <w:tcPr>
-            <w:tcW w:type="dxa" w:w="1500"/>
-          </w:tcPr>
-          <w:p>
-            <w:r>
-              <w:rPr>
-                <w:b w:val="false"/>
-                <w:bCs w:val="false"/>
-                <w:sz w:val="19"/>
-                <w:szCs w:val="19"/>
-              </w:rPr>
-              <w:t xml:space="preserve">201</w:t>
-            </w:r>
-          </w:p>
-        </w:tc>
-        <w:tc>
-          <w:tcPr>
-            <w:tcW w:type="dxa" w:w="2500"/>
-          </w:tcPr>
-          <w:p>
-            <w:r>
-              <w:rPr>
-                <w:b w:val="false"/>
-                <w:bCs w:val="false"/>
-                <w:sz w:val="19"/>
-                <w:szCs w:val="19"/>
-              </w:rPr>
-              <w:t xml:space="preserve">22.28%</w:t>
-            </w:r>
-          </w:p>
-        </w:tc>
-        <w:tc>
-          <w:tcPr>
-            <w:tcW w:type="dxa" w:w="2500"/>
-          </w:tcPr>
-          <w:p>
-            <w:r>
-              <w:rPr>
-                <w:b w:val="false"/>
-                <w:bCs w:val="false"/>
-                <w:sz w:val="19"/>
-                <w:szCs w:val="19"/>
-              </w:rPr>
-              <w:t xml:space="preserve">17.79%</w:t>
-            </w:r>
-          </w:p>
-        </w:tc>
-        <w:tc>
-          <w:tcPr>
-            <w:tcW w:type="dxa" w:w="2900"/>
-          </w:tcPr>
-          <w:p>
-            <w:r>
-              <w:rPr>
-                <w:b w:val="false"/>
-                <w:bCs w:val="false"/>
-                <w:sz w:val="19"/>
-                <w:szCs w:val="19"/>
-              </w:rPr>
-              <w:t xml:space="preserve">28.38%</w:t>
+            <w:tcW w:type="dxa" w:w="1800"/>
+          </w:tcPr>
+          <w:p>
+            <w:r>
+              <w:rPr>
+                <w:b w:val="false"/>
+                <w:bCs w:val="false"/>
+                <w:sz w:val="19"/>
+                <w:szCs w:val="19"/>
+              </w:rPr>
+              <w:t xml:space="preserve">701</w:t>
+            </w:r>
+          </w:p>
+        </w:tc>
+        <w:tc>
+          <w:tcPr>
+            <w:tcW w:type="dxa" w:w="3800"/>
+          </w:tcPr>
+          <w:p>
+            <w:r>
+              <w:rPr>
+                <w:b w:val="false"/>
+                <w:bCs w:val="false"/>
+                <w:sz w:val="19"/>
+                <w:szCs w:val="19"/>
+              </w:rPr>
+              <w:t xml:space="preserve">34.34%</w:t>
+            </w:r>
+          </w:p>
+        </w:tc>
+        <w:tc>
+          <w:tcPr>
+            <w:tcW w:type="dxa" w:w="3800"/>
+          </w:tcPr>
+          <w:p>
+            <w:r>
+              <w:rPr>
+                <w:b w:val="false"/>
+                <w:bCs w:val="false"/>
+                <w:sz w:val="19"/>
+                <w:szCs w:val="19"/>
+              </w:rPr>
+              <w:t xml:space="preserve">5.88%</w:t>
             </w:r>
           </w:p>
         </w:tc>
@@ -607,205 +469,7 @@
       <w:tr>
         <w:tc>
           <w:tcPr>
-            <w:tcW w:type="dxa" w:w="1500"/>
-          </w:tcPr>
-          <w:p>
-            <w:r>
-              <w:rPr>
-                <w:b w:val="false"/>
-                <w:bCs w:val="false"/>
-                <w:sz w:val="19"/>
-                <w:szCs w:val="19"/>
-              </w:rPr>
-              <w:t xml:space="preserve">401</w:t>
-            </w:r>
-          </w:p>
-        </w:tc>
-        <w:tc>
-          <w:tcPr>
-            <w:tcW w:type="dxa" w:w="2500"/>
-          </w:tcPr>
-          <w:p>
-            <w:r>
-              <w:rPr>
-                <w:b w:val="false"/>
-                <w:bCs w:val="false"/>
-                <w:sz w:val="19"/>
-                <w:szCs w:val="19"/>
-              </w:rPr>
-              <w:t xml:space="preserve">28.97%</w:t>
-            </w:r>
-          </w:p>
-        </w:tc>
-        <w:tc>
-          <w:tcPr>
-            <w:tcW w:type="dxa" w:w="2500"/>
-          </w:tcPr>
-          <w:p>
-            <w:r>
-              <w:rPr>
-                <w:b w:val="false"/>
-                <w:bCs w:val="false"/>
-                <w:sz w:val="19"/>
-                <w:szCs w:val="19"/>
-              </w:rPr>
-              <w:t xml:space="preserve">24.73%</w:t>
-            </w:r>
-          </w:p>
-        </w:tc>
-        <w:tc>
-          <w:tcPr>
-            <w:tcW w:type="dxa" w:w="2900"/>
-          </w:tcPr>
-          <w:p>
-            <w:r>
-              <w:rPr>
-                <w:b w:val="false"/>
-                <w:bCs w:val="false"/>
-                <w:sz w:val="19"/>
-                <w:szCs w:val="19"/>
-              </w:rPr>
-              <w:t xml:space="preserve">36.92%</w:t>
-            </w:r>
-          </w:p>
-        </w:tc>
-      </w:tr>
-      <w:tr>
-        <w:tc>
-          <w:tcPr>
-            <w:tcW w:type="dxa" w:w="1500"/>
-          </w:tcPr>
-          <w:p>
-            <w:r>
-              <w:rPr>
-                <w:b w:val="false"/>
-                <w:bCs w:val="false"/>
-                <w:sz w:val="19"/>
-                <w:szCs w:val="19"/>
-              </w:rPr>
-              <w:t xml:space="preserve">701</w:t>
-            </w:r>
-          </w:p>
-        </w:tc>
-        <w:tc>
-          <w:tcPr>
-            <w:tcW w:type="dxa" w:w="2500"/>
-          </w:tcPr>
-          <w:p>
-            <w:r>
-              <w:rPr>
-                <w:b w:val="false"/>
-                <w:bCs w:val="false"/>
-                <w:sz w:val="19"/>
-                <w:szCs w:val="19"/>
-              </w:rPr>
-              <w:t xml:space="preserve">34.34%</w:t>
-            </w:r>
-          </w:p>
-        </w:tc>
-        <w:tc>
-          <w:tcPr>
-            <w:tcW w:type="dxa" w:w="2500"/>
-          </w:tcPr>
-          <w:p>
-            <w:r>
-              <w:rPr>
-                <w:b w:val="false"/>
-                <w:bCs w:val="false"/>
-                <w:sz w:val="19"/>
-                <w:szCs w:val="19"/>
-              </w:rPr>
-              <w:t xml:space="preserve">30.60%</w:t>
-            </w:r>
-          </w:p>
-        </w:tc>
-        <w:tc>
-          <w:tcPr>
-            <w:tcW w:type="dxa" w:w="2900"/>
-          </w:tcPr>
-          <w:p>
-            <w:r>
-              <w:rPr>
-                <w:b w:val="false"/>
-                <w:bCs w:val="false"/>
-                <w:sz w:val="19"/>
-                <w:szCs w:val="19"/>
-              </w:rPr>
-              <w:t xml:space="preserve">44.87%</w:t>
-            </w:r>
-          </w:p>
-        </w:tc>
-      </w:tr>
-      <w:tr>
-        <w:tc>
-          <w:tcPr>
-            <w:tcW w:type="dxa" w:w="1500"/>
-          </w:tcPr>
-          <w:p>
-            <w:r>
-              <w:rPr>
-                <w:b w:val="false"/>
-                <w:bCs w:val="false"/>
-                <w:sz w:val="19"/>
-                <w:szCs w:val="19"/>
-              </w:rPr>
-              <w:t xml:space="preserve">1001</w:t>
-            </w:r>
-          </w:p>
-        </w:tc>
-        <w:tc>
-          <w:tcPr>
-            <w:tcW w:type="dxa" w:w="2500"/>
-          </w:tcPr>
-          <w:p>
-            <w:r>
-              <w:rPr>
-                <w:b w:val="false"/>
-                <w:bCs w:val="false"/>
-                <w:sz w:val="19"/>
-                <w:szCs w:val="19"/>
-              </w:rPr>
-              <w:t xml:space="preserve">38.82%</w:t>
-            </w:r>
-          </w:p>
-        </w:tc>
-        <w:tc>
-          <w:tcPr>
-            <w:tcW w:type="dxa" w:w="2500"/>
-          </w:tcPr>
-          <w:p>
-            <w:r>
-              <w:rPr>
-                <w:b w:val="false"/>
-                <w:bCs w:val="false"/>
-                <w:sz w:val="19"/>
-                <w:szCs w:val="19"/>
-              </w:rPr>
-              <w:t xml:space="preserve">34.86%</w:t>
-            </w:r>
-          </w:p>
-        </w:tc>
-        <w:tc>
-          <w:tcPr>
-            <w:tcW w:type="dxa" w:w="2900"/>
-          </w:tcPr>
-          <w:p>
-            <w:r>
-              <w:rPr>
-                <w:b w:val="false"/>
-                <w:bCs w:val="false"/>
-                <w:sz w:val="19"/>
-                <w:szCs w:val="19"/>
-              </w:rPr>
-              <w:t xml:space="preserve">51.82%</w:t>
-            </w:r>
-          </w:p>
-        </w:tc>
-      </w:tr>
-      <w:tr>
-        <w:tc>
-          <w:tcPr>
-            <w:tcW w:type="dxa" w:w="1500"/>
+            <w:tcW w:type="dxa" w:w="1800"/>
           </w:tcPr>
           <w:p>
             <w:r>
@@ -821,7 +485,7 @@
         </w:tc>
         <w:tc>
           <w:tcPr>
-            <w:tcW w:type="dxa" w:w="2500"/>
+            <w:tcW w:type="dxa" w:w="3800"/>
           </w:tcPr>
           <w:p>
             <w:r>
@@ -837,33 +501,17 @@
         </w:tc>
         <w:tc>
           <w:tcPr>
-            <w:tcW w:type="dxa" w:w="2500"/>
-          </w:tcPr>
-          <w:p>
-            <w:r>
-              <w:rPr>
-                <w:b w:val="false"/>
-                <w:bCs w:val="false"/>
-                <w:sz w:val="19"/>
-                <w:szCs w:val="19"/>
-              </w:rPr>
-              <w:t xml:space="preserve">39.49%</w:t>
-            </w:r>
-          </w:p>
-        </w:tc>
-        <w:tc>
-          <w:tcPr>
-            <w:tcW w:type="dxa" w:w="2900"/>
-          </w:tcPr>
-          <w:p>
-            <w:r>
-              <w:rPr>
-                <w:b w:val="false"/>
-                <w:bCs w:val="false"/>
-                <w:sz w:val="19"/>
-                <w:szCs w:val="19"/>
-              </w:rPr>
-              <w:t xml:space="preserve">61.16%</w:t>
+            <w:tcW w:type="dxa" w:w="3800"/>
+          </w:tcPr>
+          <w:p>
+            <w:r>
+              <w:rPr>
+                <w:b w:val="false"/>
+                <w:bCs w:val="false"/>
+                <w:sz w:val="19"/>
+                <w:szCs w:val="19"/>
+              </w:rPr>
+              <w:t xml:space="preserve">5.85%</w:t>
             </w:r>
           </w:p>
         </w:tc>
@@ -880,7 +528,7 @@
           <w:sz w:val="18"/>
           <w:szCs w:val="18"/>
         </w:rPr>
-        <w:t xml:space="preserve">Table 1. NO accuracy vs. resolution, real ground truth at every N (full table has 16 rows, N=13-1401; abridged here).</w:t>
+        <w:t xml:space="preserve">Table 1. disp_rel_L2 vs. a real FEM ground truth at every N, both checkpoints (full 16-row tables available). Ground-truth convergence confirmed at every resolution, relative residual 4.6e-10 to 1.0e-10 throughout.</w:t>
       </w:r>
     </w:p>
     <w:p>
@@ -940,7 +588,7 @@
           <w:sz w:val="18"/>
           <w:szCs w:val="18"/>
         </w:rPr>
-        <w:t xml:space="preserve">Figure 1. NO accuracy degradation, N=49 (top of the originally validated range) to N=1401.</w:t>
+        <w:t xml:space="preserve">Figure 1. Original checkpoint's accuracy degradation, N=49 to N=1401 (pre-retraining).</w:t>
       </w:r>
     </w:p>
     <w:p>
@@ -948,7 +596,7 @@
         <w:spacing w:after="160"/>
       </w:pPr>
       <w:r>
-        <w:t xml:space="preserve">Comparing this against native FEM (torch-fem) at the same low resolutions, across the same QoI set (L2, H1, tangent energy, peak PK1 stress, reaction resultant): a near-degenerate FEM mesh (as coarse as N=3-9, i.e. 9-81 nodes) already matches or beats the operator's own best-case accuracy in L2, H1, energy, and reactions.</w:t>
+        <w:t xml:space="preserve">Widening the training-resolution set does not just shrink the error — it changes its whole shape: the original checkpoint degraded monotonically the further N got from 21/33, up to 44.65% at N=1401. The retrained checkpoint instead gets progressively more accurate up to ~N=45-49 (best 2.3%), then plateaus around 5.8-5.9% instead of continuing to climb — a 7.6x reduction in error at N=1401.</w:t>
       </w:r>
     </w:p>
     <w:p>
@@ -956,7 +604,46 @@
         <w:spacing w:after="160"/>
       </w:pPr>
       <w:r>
-        <w:t xml:space="preserve">One QoI needs an explicit caveat rather than a clean number: peak PK1 stress, evaluated at a fixed location/value located once from a fine reference (same convention for both methods). Both methods converge to it very slowly — torch-fem's own error there barely improves from 83% to 62% across the whole low-N range, while its other QoIs converge at the expected rate over the same range. The located point sits essentially at the domain corner where the fixed boundary meets the free edge — a classic boundary-condition-transition location prone to a stress singularity in elasticity, where the continuum target may not even be well-posed for either method to converge to in the usual sense. We think this metric should be reported with that caveat attached rather than used as a clean deciding factor.</w:t>
+        <w:t xml:space="preserve">Comparing the retrained checkpoint's full QoI set (L2, H1, tangent energy, peak PK1 stress, reaction resultant) against native FEM at the same low resolutions (N=3-49):</w:t>
+      </w:r>
+    </w:p>
+    <w:p>
+      <w:pPr>
+        <w:pStyle w:val="ListParagraph"/>
+        <w:numPr>
+          <w:ilvl w:val="0"/>
+          <w:numId w:val="1"/>
+        </w:numPr>
+        <w:spacing w:after="100"/>
+      </w:pPr>
+      <w:r>
+        <w:t xml:space="preserve">For L2, H1, tangent energy, and reactions, a near-degenerate FEM mesh (N=3-9) still matches or beats the operator's accuracy — unchanged from before.</w:t>
+      </w:r>
+    </w:p>
+    <w:p>
+      <w:pPr>
+        <w:pStyle w:val="ListParagraph"/>
+        <w:numPr>
+          <w:ilvl w:val="0"/>
+          <w:numId w:val="1"/>
+        </w:numPr>
+        <w:spacing w:after="100"/>
+      </w:pPr>
+      <w:r>
+        <w:t xml:space="preserve">Peak PK1 stress (evaluated at a fixed physical location located once from a fine reference, not the coarse mesh's own sample-max) tells a genuinely different story now: the retrained checkpoint's peak-stress accuracy (42-70% relative error, improved at every single N) is now BETTER than anything torch-fem achieves in the same low-N range (62% at best, N=49) for every NO resolution from N=29 upward. FEM would need N&gt;49 (untested here) to match it.</w:t>
+      </w:r>
+    </w:p>
+    <w:p>
+      <w:pPr>
+        <w:pStyle w:val="ListParagraph"/>
+        <w:numPr>
+          <w:ilvl w:val="0"/>
+          <w:numId w:val="1"/>
+        </w:numPr>
+        <w:spacing w:after="100"/>
+      </w:pPr>
+      <w:r>
+        <w:t xml:space="preserve">As a result, the "coarsest suitable FEM" is now bound by tangent energy rather than peak stress for most resolutions, and dropped from N=17-45 (original checkpoint) to a genuinely near-degenerate N=9-17 (retrained checkpoint) for almost every resolution tested.</w:t>
       </w:r>
     </w:p>
     <w:p>
@@ -964,7 +651,7 @@
         <w:spacing w:after="160"/>
       </w:pPr>
       <w:r>
-        <w:t xml:space="preserve">We are also mid-way through retraining the operator on a wider spread of resolutions (adding N=101 and 201 to the original 21/33) to see how much of the degradation above is an ordinary, addressable resolution-generalization gap. Validation error has already dropped substantially during training, but we have not yet re-run the same rigorous FEM-referenced check on the new checkpoint — will follow up with that once it's verified.</w:t>
+        <w:t xml:space="preserve">The same caveat as before still applies to peak stress specifically: the located point sits essentially at the domain corner where the fixed boundary meets the free edge — a classic boundary-condition-transition location prone to a stress singularity, where the continuum target may not be well-posed for either method to converge to cleanly. Both methods still converge to it slowly. We think this metric should carry that caveat rather than be read as an unqualified result — but the improvement itself is real and directly measured against independent FEM ground truth, not a training-validation artifact.</w:t>
       </w:r>
     </w:p>
     <w:p>
@@ -1868,7 +1555,7 @@
         <w:spacing w:after="160"/>
       </w:pPr>
       <w:r>
-        <w:t xml:space="preserve">TF32 matmul precision (Ampere tensor cores) gives the best result found — 5.82x combined with torch.compile — at a real but small accuracy cost, checked directly rather than assumed.</w:t>
+        <w:t xml:space="preserve">torch.compile alone gives 1.07x (correctness-checked, negligible output difference). Enabling TF32 matmul precision (Ampere tensor cores) gives 4.67x alone and 5.82x combined with torch.compile — the best result found, at a real but small accuracy cost (~3.2e-3 relative difference vs. strict fp32), checked directly rather than assumed.</w:t>
       </w:r>
     </w:p>
     <w:p>
@@ -2203,7 +1890,242 @@
         <w:spacing w:after="160"/>
       </w:pPr>
       <w:r>
-        <w:t xml:space="preserve">Planned as the direct follow-on once item 1's numbers are finalized (after the retraining check mentioned above) — an update here would be premature before that.</w:t>
+        <w:t xml:space="preserve">Using the retrained checkpoint's own coarsest-suitable FEM at N=1401 (N=11, from the crossover above) against the NO's real inference cost there, and the real training wall-clock for the retrained checkpoint (41,881s, ~11.6h — confirmed from its own training log; it stopped itself via early stopping, 8 checks with no improvement, exactly as configured):</w:t>
+      </w:r>
+    </w:p>
+    <w:tbl>
+      <w:tblPr>
+        <w:tblW w:type="dxa" w:w="10600"/>
+        <w:tblBorders>
+          <w:top w:val="single" w:color="auto" w:sz="4"/>
+          <w:left w:val="single" w:color="auto" w:sz="4"/>
+          <w:bottom w:val="single" w:color="auto" w:sz="4"/>
+          <w:right w:val="single" w:color="auto" w:sz="4"/>
+          <w:insideH w:val="single" w:color="auto" w:sz="4"/>
+          <w:insideV w:val="single" w:color="auto" w:sz="4"/>
+        </w:tblBorders>
+      </w:tblPr>
+      <w:tblGrid>
+        <w:gridCol w:w="2600"/>
+        <w:gridCol w:w="2200"/>
+        <w:gridCol w:w="2400"/>
+        <w:gridCol w:w="3400"/>
+      </w:tblGrid>
+      <w:tr>
+        <w:tc>
+          <w:tcPr>
+            <w:tcW w:type="dxa" w:w="2600"/>
+            <w:shd w:fill="DDDDDD" w:val="clear"/>
+          </w:tcPr>
+          <w:p>
+            <w:r>
+              <w:rPr>
+                <w:b/>
+                <w:bCs/>
+                <w:sz w:val="19"/>
+                <w:szCs w:val="19"/>
+              </w:rPr>
+              <w:t xml:space="preserve">NO inference mode</w:t>
+            </w:r>
+          </w:p>
+        </w:tc>
+        <w:tc>
+          <w:tcPr>
+            <w:tcW w:type="dxa" w:w="2200"/>
+            <w:shd w:fill="DDDDDD" w:val="clear"/>
+          </w:tcPr>
+          <w:p>
+            <w:r>
+              <w:rPr>
+                <w:b/>
+                <w:bCs/>
+                <w:sz w:val="19"/>
+                <w:szCs w:val="19"/>
+              </w:rPr>
+              <w:t xml:space="preserve">ms/sample @ N=1401</w:t>
+            </w:r>
+          </w:p>
+        </w:tc>
+        <w:tc>
+          <w:tcPr>
+            <w:tcW w:type="dxa" w:w="2400"/>
+            <w:shd w:fill="DDDDDD" w:val="clear"/>
+          </w:tcPr>
+          <w:p>
+            <w:r>
+              <w:rPr>
+                <w:b/>
+                <w:bCs/>
+                <w:sz w:val="19"/>
+                <w:szCs w:val="19"/>
+              </w:rPr>
+              <w:t xml:space="preserve">vs. FEM@N=11 (1,625.6 ms)</w:t>
+            </w:r>
+          </w:p>
+        </w:tc>
+        <w:tc>
+          <w:tcPr>
+            <w:tcW w:type="dxa" w:w="3400"/>
+            <w:shd w:fill="DDDDDD" w:val="clear"/>
+          </w:tcPr>
+          <w:p>
+            <w:r>
+              <w:rPr>
+                <w:b/>
+                <w:bCs/>
+                <w:sz w:val="19"/>
+                <w:szCs w:val="19"/>
+              </w:rPr>
+              <w:t xml:space="preserve">Break-even</w:t>
+            </w:r>
+          </w:p>
+        </w:tc>
+      </w:tr>
+      <w:tr>
+        <w:tc>
+          <w:tcPr>
+            <w:tcW w:type="dxa" w:w="2600"/>
+          </w:tcPr>
+          <w:p>
+            <w:r>
+              <w:rPr>
+                <w:b w:val="false"/>
+                <w:bCs w:val="false"/>
+                <w:sz w:val="19"/>
+                <w:szCs w:val="19"/>
+              </w:rPr>
+              <w:t xml:space="preserve">eager fp32 (default)</w:t>
+            </w:r>
+          </w:p>
+        </w:tc>
+        <w:tc>
+          <w:tcPr>
+            <w:tcW w:type="dxa" w:w="2200"/>
+          </w:tcPr>
+          <w:p>
+            <w:r>
+              <w:rPr>
+                <w:b w:val="false"/>
+                <w:bCs w:val="false"/>
+                <w:sz w:val="19"/>
+                <w:szCs w:val="19"/>
+              </w:rPr>
+              <w:t xml:space="preserve">2,292.1</w:t>
+            </w:r>
+          </w:p>
+        </w:tc>
+        <w:tc>
+          <w:tcPr>
+            <w:tcW w:type="dxa" w:w="2400"/>
+          </w:tcPr>
+          <w:p>
+            <w:r>
+              <w:rPr>
+                <w:b w:val="false"/>
+                <w:bCs w:val="false"/>
+                <w:sz w:val="19"/>
+                <w:szCs w:val="19"/>
+              </w:rPr>
+              <w:t xml:space="preserve">0.71x (slower)</w:t>
+            </w:r>
+          </w:p>
+        </w:tc>
+        <w:tc>
+          <w:tcPr>
+            <w:tcW w:type="dxa" w:w="3400"/>
+          </w:tcPr>
+          <w:p>
+            <w:r>
+              <w:rPr>
+                <w:b w:val="false"/>
+                <w:bCs w:val="false"/>
+                <w:sz w:val="19"/>
+                <w:szCs w:val="19"/>
+              </w:rPr>
+              <w:t xml:space="preserve">Never -- accuracy-matched FEM already cheaper</w:t>
+            </w:r>
+          </w:p>
+        </w:tc>
+      </w:tr>
+      <w:tr>
+        <w:tc>
+          <w:tcPr>
+            <w:tcW w:type="dxa" w:w="2600"/>
+          </w:tcPr>
+          <w:p>
+            <w:r>
+              <w:rPr>
+                <w:b w:val="false"/>
+                <w:bCs w:val="false"/>
+                <w:sz w:val="19"/>
+                <w:szCs w:val="19"/>
+              </w:rPr>
+              <w:t xml:space="preserve">compile + TF32</w:t>
+            </w:r>
+          </w:p>
+        </w:tc>
+        <w:tc>
+          <w:tcPr>
+            <w:tcW w:type="dxa" w:w="2200"/>
+          </w:tcPr>
+          <w:p>
+            <w:r>
+              <w:rPr>
+                <w:b w:val="false"/>
+                <w:bCs w:val="false"/>
+                <w:sz w:val="19"/>
+                <w:szCs w:val="19"/>
+              </w:rPr>
+              <w:t xml:space="preserve">394.0</w:t>
+            </w:r>
+          </w:p>
+        </w:tc>
+        <w:tc>
+          <w:tcPr>
+            <w:tcW w:type="dxa" w:w="2400"/>
+          </w:tcPr>
+          <w:p>
+            <w:r>
+              <w:rPr>
+                <w:b w:val="false"/>
+                <w:bCs w:val="false"/>
+                <w:sz w:val="19"/>
+                <w:szCs w:val="19"/>
+              </w:rPr>
+              <w:t xml:space="preserve">4.13x (faster)</w:t>
+            </w:r>
+          </w:p>
+        </w:tc>
+        <w:tc>
+          <w:tcPr>
+            <w:tcW w:type="dxa" w:w="3400"/>
+          </w:tcPr>
+          <w:p>
+            <w:r>
+              <w:rPr>
+                <w:b w:val="false"/>
+                <w:bCs w:val="false"/>
+                <w:sz w:val="19"/>
+                <w:szCs w:val="19"/>
+              </w:rPr>
+              <w:t xml:space="preserve">After 34,005 samples (~3.72 GPU-hours)</w:t>
+            </w:r>
+          </w:p>
+        </w:tc>
+      </w:tr>
+    </w:tbl>
+    <w:p>
+      <w:pPr>
+        <w:spacing w:after="260"/>
+      </w:pPr>
+      <w:r>
+        <w:rPr>
+          <w:i/>
+          <w:iCs/>
+          <w:sz w:val="18"/>
+          <w:szCs w:val="18"/>
+        </w:rPr>
+        <w:t xml:space="preserve">Table 5. Accuracy-matched break-even: NO@N=1401 vs. torch-fem@N=11 (coarsest suitable FEM for the retrained checkpoint).</w:t>
       </w:r>
     </w:p>
     <w:p>
@@ -2211,6 +2133,14 @@
         <w:spacing w:after="160"/>
       </w:pPr>
       <w:r>
+        <w:t xml:space="preserve">This is the one place in the whole investigation where the NO's default (unoptimized) deployment mode does not come out ahead: run naively, it never repays its own training cost against a FEM mesh that is only as accurate as it needs to be. With the inference optimizations from point 3 (torch.compile + TF32, already verified, ~3.2e-3 relative accuracy cost), it both wins per-sample (4.13x) and repays its training cost cheaply — about 3.72 GPU-hours against 11.6 GPU-hours of training. We think the honest framing is that the operator's economic case depends on deploying it with these optimizations, not on its default settings.</w:t>
+      </w:r>
+    </w:p>
+    <w:p>
+      <w:pPr>
+        <w:spacing w:after="160"/>
+      </w:pPr>
+      <w:r>
         <w:t xml:space="preserve"/>
       </w:r>
     </w:p>
@@ -2219,7 +2149,7 @@
         <w:spacing w:after="160"/>
       </w:pPr>
       <w:r>
-        <w:t xml:space="preserve">Let me know if the framing above looks right, particularly on point 1's stress-singularity caveat and on point 4.</w:t>
+        <w:t xml:space="preserve">Let me know if the framing above looks right, particularly on point 1's stress-singularity caveat, point 4's design question, and point 5's "only pays off with optimized inference" framing.</w:t>
       </w:r>
     </w:p>
     <w:p>

</xml_diff>